<commit_message>
feat: add AI-assisted projects to portfolio and resume
</commit_message>
<xml_diff>
--- a/assets/downloads/hejiaming-resume-editable.docx
+++ b/assets/downloads/hejiaming-resume-editable.docx
@@ -32,7 +32,7 @@
           <w:color w:val="5B6570"/>
           <w:sz w:val="21"/>
         </w:rPr>
-        <w:t>电子信息工程 | 嵌入式基础 | 流程工程化与持续改进</w:t>
+        <w:t>电子信息工程 | AI 协作开发 | 嵌入式基础 | 流程工程化</w:t>
       </w:r>
     </w:p>
     <w:p>
@@ -75,7 +75,7 @@
           <w:color w:val="2A313A"/>
           <w:sz w:val="20"/>
         </w:rPr>
-        <w:t>电子信息工程专业基础与制造现场持续改进经验的复合型候选人。熟悉 STM32、基础电路与 Python 等技术；能够以需求澄清、流程建模、问题定位、跨团队协同、验证与复盘的工程化方式推进任务，重视数据、文档和可落地的交付。</w:t>
+        <w:t>电子信息工程专业基础与制造现场持续改进经验的复合型候选人。能使用 Codex 辅助需求拆解、代码实现、测试与文档，并对 AI 输出进行人工复核；具备 STM32、Python/TypeScript、桌面应用和本地数据工程实践，重视需求边界、验证证据与可落地交付。</w:t>
       </w:r>
     </w:p>
     <w:p>
@@ -315,7 +315,7 @@
           <w:color w:val="0F4B50"/>
           <w:sz w:val="20"/>
         </w:rPr>
-        <w:t>软件与数据：</w:t>
+        <w:t>软件、数据与 AI 协作：</w:t>
       </w:r>
       <w:r>
         <w:rPr>
@@ -323,7 +323,7 @@
           <w:color w:val="2A313A"/>
           <w:sz w:val="20"/>
         </w:rPr>
-        <w:t>Python、TensorFlow、Pandas、Matplotlib、MySQL、SQLite、Linux/Shell、HTML/CSS/Vue 基础。</w:t>
+        <w:t>Python、TypeScript、React/Vue、Electron、SQLite、Git/GitHub Pages；Codex 辅助需求、实现、测试与文档，人工负责取舍、复核和验收。</w:t>
       </w:r>
     </w:p>
     <w:p>
@@ -640,7 +640,7 @@
           <w:color w:val="2A313A"/>
           <w:sz w:val="21"/>
         </w:rPr>
-        <w:t>网页数据抓取与可视化实践</w:t>
+        <w:t>B 站视频知识整理助手</w:t>
       </w:r>
       <w:r>
         <w:rPr>
@@ -648,7 +648,7 @@
           <w:color w:val="5B6570"/>
           <w:sz w:val="18"/>
         </w:rPr>
-        <w:t xml:space="preserve">  |  2026.07</w:t>
+        <w:t xml:space="preserve">  |  2026.07 - 至今</w:t>
       </w:r>
     </w:p>
     <w:p>
@@ -671,7 +671,7 @@
           <w:color w:val="5B6570"/>
           <w:sz w:val="20"/>
         </w:rPr>
-        <w:t>个人学习实践 | Python、Pandas、Matplotlib、HTML 解析</w:t>
+        <w:t>个人项目 | AI 协作开发 | Python、Vue 3、TypeScript、Electron、SQLite</w:t>
       </w:r>
     </w:p>
     <w:p>
@@ -686,7 +686,7 @@
           <w:color w:val="0F4B50"/>
           <w:sz w:val="20"/>
         </w:rPr>
-        <w:t>本人参与：</w:t>
+        <w:t>本人负责：</w:t>
       </w:r>
       <w:r>
         <w:rPr>
@@ -694,7 +694,145 @@
           <w:color w:val="2A313A"/>
           <w:sz w:val="20"/>
         </w:rPr>
-        <w:t>完成公开网页信息的请求、解析、字段提取与 DataFrame 整理；进行数据清洗、分类和时间维度统计，输出基础图表并记录数据质量问题。</w:t>
+        <w:t>将网页抓取与可视化实践演进为本地视频知识流水线，完成字幕/转录、结构化摘要、术语卡、人工确认关系图、数据审计与脱敏失败历史；使用 Codex 辅助架构、实现和回归测试，当前 46 项离线测试及桌面生产构建通过。</w:t>
+      </w:r>
+    </w:p>
+    <w:p>
+      <w:pPr>
+        <w:pStyle w:val="ResumeSubsection"/>
+        <w:keepNext/>
+      </w:pPr>
+      <w:r>
+        <w:rPr>
+          <w:rFonts w:ascii="Microsoft YaHei" w:hAnsi="Microsoft YaHei" w:eastAsia="Microsoft YaHei"/>
+          <w:b/>
+          <w:color w:val="2A313A"/>
+          <w:sz w:val="21"/>
+        </w:rPr>
+        <w:t>个人博客改版与持续维护</w:t>
+      </w:r>
+      <w:r>
+        <w:rPr>
+          <w:rFonts w:ascii="Microsoft YaHei" w:hAnsi="Microsoft YaHei" w:eastAsia="Microsoft YaHei"/>
+          <w:color w:val="5B6570"/>
+          <w:sz w:val="18"/>
+        </w:rPr>
+        <w:t xml:space="preserve">  |  2026.07 - 至今</w:t>
+      </w:r>
+    </w:p>
+    <w:p>
+      <w:pPr>
+        <w:spacing w:after="40"/>
+        <w:ind w:left="216" w:hanging="216"/>
+      </w:pPr>
+      <w:r>
+        <w:rPr>
+          <w:rFonts w:ascii="Microsoft YaHei" w:hAnsi="Microsoft YaHei" w:eastAsia="Microsoft YaHei"/>
+          <w:b/>
+          <w:color w:val="0F4B50"/>
+          <w:sz w:val="20"/>
+        </w:rPr>
+        <w:t>技术/协作：</w:t>
+      </w:r>
+      <w:r>
+        <w:rPr>
+          <w:rFonts w:ascii="Microsoft YaHei" w:hAnsi="Microsoft YaHei" w:eastAsia="Microsoft YaHei"/>
+          <w:color w:val="5B6570"/>
+          <w:sz w:val="20"/>
+        </w:rPr>
+        <w:t>个人项目 | Jekyll、Chirpy、SCSS、GitHub Pages、Codex、Gemini</w:t>
+      </w:r>
+    </w:p>
+    <w:p>
+      <w:pPr>
+        <w:spacing w:after="100"/>
+        <w:ind w:left="216" w:hanging="216"/>
+      </w:pPr>
+      <w:r>
+        <w:rPr>
+          <w:rFonts w:ascii="Microsoft YaHei" w:hAnsi="Microsoft YaHei" w:eastAsia="Microsoft YaHei"/>
+          <w:b/>
+          <w:color w:val="0F4B50"/>
+          <w:sz w:val="20"/>
+        </w:rPr>
+        <w:t>本人负责：</w:t>
+      </w:r>
+      <w:r>
+        <w:rPr>
+          <w:rFonts w:ascii="Microsoft YaHei" w:hAnsi="Microsoft YaHei" w:eastAsia="Microsoft YaHei"/>
+          <w:color w:val="2A313A"/>
+          <w:sz w:val="20"/>
+        </w:rPr>
+        <w:t>围绕求职场景重构信息架构、深浅主题、响应式页面和部署流程；Codex 辅助实现、调试与测试，Gemini 提供早期 UI 方向参考，本人负责需求取舍、内容校对和线上多尺寸人工验收。</w:t>
+      </w:r>
+    </w:p>
+    <w:p>
+      <w:pPr>
+        <w:pStyle w:val="ResumeSubsection"/>
+        <w:keepNext/>
+      </w:pPr>
+      <w:r>
+        <w:rPr>
+          <w:rFonts w:ascii="Microsoft YaHei" w:hAnsi="Microsoft YaHei" w:eastAsia="Microsoft YaHei"/>
+          <w:b/>
+          <w:color w:val="2A313A"/>
+          <w:sz w:val="21"/>
+        </w:rPr>
+        <w:t>Life Matrix &amp; Chronicle</w:t>
+      </w:r>
+      <w:r>
+        <w:rPr>
+          <w:rFonts w:ascii="Microsoft YaHei" w:hAnsi="Microsoft YaHei" w:eastAsia="Microsoft YaHei"/>
+          <w:color w:val="5B6570"/>
+          <w:sz w:val="18"/>
+        </w:rPr>
+        <w:t xml:space="preserve">  |  2026.08 - 至今</w:t>
+      </w:r>
+    </w:p>
+    <w:p>
+      <w:pPr>
+        <w:spacing w:after="40"/>
+        <w:ind w:left="216" w:hanging="216"/>
+      </w:pPr>
+      <w:r>
+        <w:rPr>
+          <w:rFonts w:ascii="Microsoft YaHei" w:hAnsi="Microsoft YaHei" w:eastAsia="Microsoft YaHei"/>
+          <w:b/>
+          <w:color w:val="0F4B50"/>
+          <w:sz w:val="20"/>
+        </w:rPr>
+        <w:t>技术/协作：</w:t>
+      </w:r>
+      <w:r>
+        <w:rPr>
+          <w:rFonts w:ascii="Microsoft YaHei" w:hAnsi="Microsoft YaHei" w:eastAsia="Microsoft YaHei"/>
+          <w:color w:val="5B6570"/>
+          <w:sz w:val="20"/>
+        </w:rPr>
+        <w:t>个人项目 | AI 协作开发 | React、TypeScript、Electron、Dexie、Zod</w:t>
+      </w:r>
+    </w:p>
+    <w:p>
+      <w:pPr>
+        <w:spacing w:after="100"/>
+        <w:ind w:left="216" w:hanging="216"/>
+      </w:pPr>
+      <w:r>
+        <w:rPr>
+          <w:rFonts w:ascii="Microsoft YaHei" w:hAnsi="Microsoft YaHei" w:eastAsia="Microsoft YaHei"/>
+          <w:b/>
+          <w:color w:val="0F4B50"/>
+          <w:sz w:val="20"/>
+        </w:rPr>
+        <w:t>本人负责：</w:t>
+      </w:r>
+      <w:r>
+        <w:rPr>
+          <w:rFonts w:ascii="Microsoft YaHei" w:hAnsi="Microsoft YaHei" w:eastAsia="Microsoft YaHei"/>
+          <w:color w:val="2A313A"/>
+          <w:sz w:val="20"/>
+        </w:rPr>
+        <w:t>从 0 到 1 定义并验收本地优先认知与行动工作台，覆盖生命矩阵、卡片关系、决策复盘、版本历史、可控 AI 和公开 Feed；Codex 辅助模块实现、测试与文档，本人负责隐私门禁、功能取舍和最终验收，当前 48 项测试与生产构建通过。</w:t>
       </w:r>
     </w:p>
     <w:p>

</xml_diff>